<commit_message>
Actualiza evidencias de Eva 2 Backend
</commit_message>
<xml_diff>
--- a/Eva2backend.docx
+++ b/Eva2backend.docx
@@ -4,6 +4,9 @@
   <w:body>
     <w:p>
       <w:r>
+        <w:rPr>
+          <w:noProof/>
+        </w:rPr>
         <w:drawing>
           <wp:anchor distT="0" distB="0" distL="114300" distR="114300" simplePos="0" relativeHeight="251658240" behindDoc="1" locked="0" layoutInCell="1" allowOverlap="1" wp14:anchorId="65DE375B" wp14:editId="6CE78EA0">
             <wp:simplePos x="0" y="0"/>
@@ -68,6 +71,9 @@
         <w:jc w:val="center"/>
       </w:pPr>
       <w:r>
+        <w:rPr>
+          <w:noProof/>
+        </w:rPr>
         <w:drawing>
           <wp:anchor distT="0" distB="0" distL="114300" distR="114300" simplePos="0" relativeHeight="251659264" behindDoc="0" locked="0" layoutInCell="1" allowOverlap="1" wp14:anchorId="7AD4945F" wp14:editId="0C4C6D53">
             <wp:simplePos x="0" y="0"/>
@@ -140,25 +146,19 @@
       </w:pPr>
       <w:r>
         <w:lastRenderedPageBreak/>
-        <w:t>3 CONSULTAS MEDIANTE GET</w:t>
-      </w:r>
-    </w:p>
-    <w:p/>
-    <w:p>
-      <w:r>
         <w:drawing>
-          <wp:anchor distT="0" distB="0" distL="114300" distR="114300" simplePos="0" relativeHeight="251660288" behindDoc="0" locked="0" layoutInCell="1" allowOverlap="1" wp14:anchorId="13426A6B" wp14:editId="51F0A779">
+          <wp:anchor distT="0" distB="0" distL="114300" distR="114300" simplePos="0" relativeHeight="251662336" behindDoc="0" locked="0" layoutInCell="1" allowOverlap="1" wp14:anchorId="19E632C9" wp14:editId="240B2772">
             <wp:simplePos x="0" y="0"/>
             <wp:positionH relativeFrom="margin">
-              <wp:align>center</wp:align>
+              <wp:align>right</wp:align>
             </wp:positionH>
             <wp:positionV relativeFrom="paragraph">
-              <wp:posOffset>702656</wp:posOffset>
+              <wp:posOffset>332798</wp:posOffset>
             </wp:positionV>
-            <wp:extent cx="6392545" cy="3581400"/>
-            <wp:effectExtent l="0" t="0" r="8255" b="0"/>
+            <wp:extent cx="5612130" cy="3150235"/>
+            <wp:effectExtent l="0" t="0" r="7620" b="0"/>
             <wp:wrapTopAndBottom/>
-            <wp:docPr id="4" name="Imagen 4"/>
+            <wp:docPr id="2" name="Imagen 2"/>
             <wp:cNvGraphicFramePr>
               <a:graphicFrameLocks xmlns:a="http://schemas.openxmlformats.org/drawingml/2006/main" noChangeAspect="1"/>
             </wp:cNvGraphicFramePr>
@@ -184,7 +184,136 @@
                   <pic:spPr>
                     <a:xfrm>
                       <a:off x="0" y="0"/>
-                      <a:ext cx="6392545" cy="3581400"/>
+                      <a:ext cx="5612130" cy="3150235"/>
+                    </a:xfrm>
+                    <a:prstGeom prst="rect">
+                      <a:avLst/>
+                    </a:prstGeom>
+                  </pic:spPr>
+                </pic:pic>
+              </a:graphicData>
+            </a:graphic>
+          </wp:anchor>
+        </w:drawing>
+      </w:r>
+      <w:r>
+        <w:t>3 CONSULTAS MEDIANTE GET</w:t>
+      </w:r>
+    </w:p>
+    <w:p>
+      <w:pPr>
+        <w:jc w:val="center"/>
+      </w:pPr>
+    </w:p>
+    <w:p/>
+    <w:p>
+      <w:pPr>
+        <w:jc w:val="center"/>
+      </w:pPr>
+      <w:r>
+        <w:drawing>
+          <wp:anchor distT="0" distB="0" distL="114300" distR="114300" simplePos="0" relativeHeight="251661312" behindDoc="0" locked="0" layoutInCell="1" allowOverlap="1" wp14:anchorId="5ADDBDD8" wp14:editId="2E62B7B4">
+            <wp:simplePos x="0" y="0"/>
+            <wp:positionH relativeFrom="margin">
+              <wp:align>right</wp:align>
+            </wp:positionH>
+            <wp:positionV relativeFrom="paragraph">
+              <wp:posOffset>437977</wp:posOffset>
+            </wp:positionV>
+            <wp:extent cx="5612130" cy="3138170"/>
+            <wp:effectExtent l="0" t="0" r="7620" b="5080"/>
+            <wp:wrapTopAndBottom/>
+            <wp:docPr id="5" name="Imagen 5"/>
+            <wp:cNvGraphicFramePr>
+              <a:graphicFrameLocks xmlns:a="http://schemas.openxmlformats.org/drawingml/2006/main" noChangeAspect="1"/>
+            </wp:cNvGraphicFramePr>
+            <a:graphic xmlns:a="http://schemas.openxmlformats.org/drawingml/2006/main">
+              <a:graphicData uri="http://schemas.openxmlformats.org/drawingml/2006/picture">
+                <pic:pic xmlns:pic="http://schemas.openxmlformats.org/drawingml/2006/picture">
+                  <pic:nvPicPr>
+                    <pic:cNvPr id="1" name=""/>
+                    <pic:cNvPicPr/>
+                  </pic:nvPicPr>
+                  <pic:blipFill>
+                    <a:blip r:embed="rId7" cstate="print">
+                      <a:extLst>
+                        <a:ext uri="{28A0092B-C50C-407E-A947-70E740481C1C}">
+                          <a14:useLocalDpi xmlns:a14="http://schemas.microsoft.com/office/drawing/2010/main" val="0"/>
+                        </a:ext>
+                      </a:extLst>
+                    </a:blip>
+                    <a:stretch>
+                      <a:fillRect/>
+                    </a:stretch>
+                  </pic:blipFill>
+                  <pic:spPr>
+                    <a:xfrm>
+                      <a:off x="0" y="0"/>
+                      <a:ext cx="5612130" cy="3138170"/>
+                    </a:xfrm>
+                    <a:prstGeom prst="rect">
+                      <a:avLst/>
+                    </a:prstGeom>
+                  </pic:spPr>
+                </pic:pic>
+              </a:graphicData>
+            </a:graphic>
+          </wp:anchor>
+        </w:drawing>
+      </w:r>
+      <w:r>
+        <w:t>4</w:t>
+      </w:r>
+      <w:r>
+        <w:t xml:space="preserve"> CONSULTA DE DETALLE MEDIANTE GET POR IDENTIFICADOR</w:t>
+      </w:r>
+    </w:p>
+    <w:p/>
+    <w:p>
+      <w:pPr>
+        <w:jc w:val="center"/>
+      </w:pPr>
+      <w:r>
+        <w:lastRenderedPageBreak/>
+        <w:drawing>
+          <wp:anchor distT="0" distB="0" distL="114300" distR="114300" simplePos="0" relativeHeight="251660288" behindDoc="0" locked="0" layoutInCell="1" allowOverlap="1" wp14:anchorId="2B438DE9" wp14:editId="51234CFC">
+            <wp:simplePos x="0" y="0"/>
+            <wp:positionH relativeFrom="margin">
+              <wp:posOffset>-166601</wp:posOffset>
+            </wp:positionH>
+            <wp:positionV relativeFrom="paragraph">
+              <wp:posOffset>276918</wp:posOffset>
+            </wp:positionV>
+            <wp:extent cx="5991860" cy="3368675"/>
+            <wp:effectExtent l="0" t="0" r="8890" b="3175"/>
+            <wp:wrapTopAndBottom/>
+            <wp:docPr id="6" name="Imagen 6"/>
+            <wp:cNvGraphicFramePr>
+              <a:graphicFrameLocks xmlns:a="http://schemas.openxmlformats.org/drawingml/2006/main" noChangeAspect="1"/>
+            </wp:cNvGraphicFramePr>
+            <a:graphic xmlns:a="http://schemas.openxmlformats.org/drawingml/2006/main">
+              <a:graphicData uri="http://schemas.openxmlformats.org/drawingml/2006/picture">
+                <pic:pic xmlns:pic="http://schemas.openxmlformats.org/drawingml/2006/picture">
+                  <pic:nvPicPr>
+                    <pic:cNvPr id="1" name=""/>
+                    <pic:cNvPicPr/>
+                  </pic:nvPicPr>
+                  <pic:blipFill>
+                    <a:blip r:embed="rId8" cstate="print">
+                      <a:extLst>
+                        <a:ext uri="{28A0092B-C50C-407E-A947-70E740481C1C}">
+                          <a14:useLocalDpi xmlns:a14="http://schemas.microsoft.com/office/drawing/2010/main" val="0"/>
+                        </a:ext>
+                      </a:extLst>
+                    </a:blip>
+                    <a:stretch>
+                      <a:fillRect/>
+                    </a:stretch>
+                  </pic:blipFill>
+                  <pic:spPr>
+                    <a:xfrm>
+                      <a:off x="0" y="0"/>
+                      <a:ext cx="5991860" cy="3368675"/>
                     </a:xfrm>
                     <a:prstGeom prst="rect">
                       <a:avLst/>
@@ -203,9 +332,144 @@
         </w:drawing>
       </w:r>
       <w:r>
-        <w:t>4</w:t>
+        <w:t>5 Creacion de registros mediante POST</w:t>
       </w:r>
     </w:p>
+    <w:p/>
+    <w:p>
+      <w:pPr>
+        <w:jc w:val="center"/>
+      </w:pPr>
+      <w:r>
+        <w:drawing>
+          <wp:anchor distT="0" distB="0" distL="114300" distR="114300" simplePos="0" relativeHeight="251663360" behindDoc="0" locked="0" layoutInCell="1" allowOverlap="1" wp14:anchorId="7C71658E" wp14:editId="3E529461">
+            <wp:simplePos x="0" y="0"/>
+            <wp:positionH relativeFrom="margin">
+              <wp:align>center</wp:align>
+            </wp:positionH>
+            <wp:positionV relativeFrom="paragraph">
+              <wp:posOffset>492875</wp:posOffset>
+            </wp:positionV>
+            <wp:extent cx="6033135" cy="3392805"/>
+            <wp:effectExtent l="0" t="0" r="5715" b="0"/>
+            <wp:wrapTopAndBottom/>
+            <wp:docPr id="7" name="Imagen 7"/>
+            <wp:cNvGraphicFramePr>
+              <a:graphicFrameLocks xmlns:a="http://schemas.openxmlformats.org/drawingml/2006/main" noChangeAspect="1"/>
+            </wp:cNvGraphicFramePr>
+            <a:graphic xmlns:a="http://schemas.openxmlformats.org/drawingml/2006/main">
+              <a:graphicData uri="http://schemas.openxmlformats.org/drawingml/2006/picture">
+                <pic:pic xmlns:pic="http://schemas.openxmlformats.org/drawingml/2006/picture">
+                  <pic:nvPicPr>
+                    <pic:cNvPr id="1" name=""/>
+                    <pic:cNvPicPr/>
+                  </pic:nvPicPr>
+                  <pic:blipFill>
+                    <a:blip r:embed="rId9" cstate="print">
+                      <a:extLst>
+                        <a:ext uri="{28A0092B-C50C-407E-A947-70E740481C1C}">
+                          <a14:useLocalDpi xmlns:a14="http://schemas.microsoft.com/office/drawing/2010/main" val="0"/>
+                        </a:ext>
+                      </a:extLst>
+                    </a:blip>
+                    <a:stretch>
+                      <a:fillRect/>
+                    </a:stretch>
+                  </pic:blipFill>
+                  <pic:spPr>
+                    <a:xfrm>
+                      <a:off x="0" y="0"/>
+                      <a:ext cx="6033135" cy="3392805"/>
+                    </a:xfrm>
+                    <a:prstGeom prst="rect">
+                      <a:avLst/>
+                    </a:prstGeom>
+                  </pic:spPr>
+                </pic:pic>
+              </a:graphicData>
+            </a:graphic>
+            <wp14:sizeRelH relativeFrom="margin">
+              <wp14:pctWidth>0</wp14:pctWidth>
+            </wp14:sizeRelH>
+            <wp14:sizeRelV relativeFrom="margin">
+              <wp14:pctHeight>0</wp14:pctHeight>
+            </wp14:sizeRelV>
+          </wp:anchor>
+        </w:drawing>
+      </w:r>
+      <w:r>
+        <w:t>6 MODIFICACION DE REGISTROS MEDIANTE PUT</w:t>
+      </w:r>
+    </w:p>
+    <w:p>
+      <w:r>
+        <w:br w:type="page"/>
+      </w:r>
+    </w:p>
+    <w:p>
+      <w:r>
+        <w:lastRenderedPageBreak/>
+        <w:drawing>
+          <wp:anchor distT="0" distB="0" distL="114300" distR="114300" simplePos="0" relativeHeight="251664384" behindDoc="0" locked="0" layoutInCell="1" allowOverlap="1" wp14:anchorId="09E5B7AF" wp14:editId="6A464762">
+            <wp:simplePos x="0" y="0"/>
+            <wp:positionH relativeFrom="margin">
+              <wp:align>center</wp:align>
+            </wp:positionH>
+            <wp:positionV relativeFrom="paragraph">
+              <wp:posOffset>405534</wp:posOffset>
+            </wp:positionV>
+            <wp:extent cx="6234430" cy="3505835"/>
+            <wp:effectExtent l="0" t="0" r="0" b="0"/>
+            <wp:wrapTopAndBottom/>
+            <wp:docPr id="8" name="Imagen 8"/>
+            <wp:cNvGraphicFramePr>
+              <a:graphicFrameLocks xmlns:a="http://schemas.openxmlformats.org/drawingml/2006/main" noChangeAspect="1"/>
+            </wp:cNvGraphicFramePr>
+            <a:graphic xmlns:a="http://schemas.openxmlformats.org/drawingml/2006/main">
+              <a:graphicData uri="http://schemas.openxmlformats.org/drawingml/2006/picture">
+                <pic:pic xmlns:pic="http://schemas.openxmlformats.org/drawingml/2006/picture">
+                  <pic:nvPicPr>
+                    <pic:cNvPr id="1" name=""/>
+                    <pic:cNvPicPr/>
+                  </pic:nvPicPr>
+                  <pic:blipFill>
+                    <a:blip r:embed="rId10" cstate="print">
+                      <a:extLst>
+                        <a:ext uri="{28A0092B-C50C-407E-A947-70E740481C1C}">
+                          <a14:useLocalDpi xmlns:a14="http://schemas.microsoft.com/office/drawing/2010/main" val="0"/>
+                        </a:ext>
+                      </a:extLst>
+                    </a:blip>
+                    <a:stretch>
+                      <a:fillRect/>
+                    </a:stretch>
+                  </pic:blipFill>
+                  <pic:spPr>
+                    <a:xfrm>
+                      <a:off x="0" y="0"/>
+                      <a:ext cx="6234430" cy="3505835"/>
+                    </a:xfrm>
+                    <a:prstGeom prst="rect">
+                      <a:avLst/>
+                    </a:prstGeom>
+                  </pic:spPr>
+                </pic:pic>
+              </a:graphicData>
+            </a:graphic>
+            <wp14:sizeRelH relativeFrom="margin">
+              <wp14:pctWidth>0</wp14:pctWidth>
+            </wp14:sizeRelH>
+            <wp14:sizeRelV relativeFrom="margin">
+              <wp14:pctHeight>0</wp14:pctHeight>
+            </wp14:sizeRelV>
+          </wp:anchor>
+        </w:drawing>
+      </w:r>
+      <w:r>
+        <w:t>7  ELIMINACION DE REGISTROS MEDIANTE DELETE</w:t>
+      </w:r>
+    </w:p>
+    <w:p/>
     <w:sectPr>
       <w:pgSz w:w="12240" w:h="15840"/>
       <w:pgMar w:top="1417" w:right="1701" w:bottom="1417" w:left="1701" w:header="708" w:footer="708" w:gutter="0"/>

</xml_diff>